<commit_message>
fidelity: three-arm (M1G, M4G, HGS-M5) small-scale comparison; M1G legacy runs linked
</commit_message>
<xml_diff>
--- a/docs/experiments/2026-09-18-small-pure-m5-vs-m4g-fidelity/apa_tables.docx
+++ b/docs/experiments/2026-09-18-small-pure-m5-vs-m4g-fidelity/apa_tables.docx
@@ -15,7 +15,7 @@
         <w:rPr>
           <w:i/>
         </w:rPr>
-        <w:t>純貪婪 HGS-M5（無價格）在小規模是否仍忠實追隨 M4G（精確解）？</w:t>
+        <w:t>純貪婪 HGS-M5 在小規模對 M4G（精確解）與 M1G（Jiao 基準）的表現？（三臂）</w:t>
       </w:r>
     </w:p>
     <w:tbl>
@@ -547,278 +547,6 @@
                 <w:sz w:val="18"/>
               </w:rPr>
               <w:t>1.45</w:t>
-            </w:r>
-          </w:p>
-        </w:tc>
-      </w:tr>
-      <w:tr>
-        <w:tc>
-          <w:tcPr>
-            <w:tcW w:type="dxa" w:w="1020"/>
-            <w:tcBorders>
-              <w:top w:val="nil"/>
-              <w:left w:val="nil"/>
-              <w:bottom w:val="nil"/>
-              <w:right w:val="nil"/>
-            </w:tcBorders>
-          </w:tcPr>
-          <w:p>
-            <w:r>
-              <w:rPr>
-                <w:rFonts w:ascii="Times New Roman" w:hAnsi="Times New Roman"/>
-                <w:sz w:val="18"/>
-              </w:rPr>
-              <w:t>m5_lambda_6b</w:t>
-            </w:r>
-          </w:p>
-        </w:tc>
-        <w:tc>
-          <w:tcPr>
-            <w:tcW w:type="dxa" w:w="1020"/>
-            <w:tcBorders>
-              <w:top w:val="nil"/>
-              <w:left w:val="nil"/>
-              <w:bottom w:val="nil"/>
-              <w:right w:val="nil"/>
-            </w:tcBorders>
-          </w:tcPr>
-          <w:p>
-            <w:r>
-              <w:rPr>
-                <w:rFonts w:ascii="Times New Roman" w:hAnsi="Times New Roman"/>
-                <w:sz w:val="18"/>
-              </w:rPr>
-              <w:t>6</w:t>
-            </w:r>
-          </w:p>
-        </w:tc>
-        <w:tc>
-          <w:tcPr>
-            <w:tcW w:type="dxa" w:w="1020"/>
-            <w:tcBorders>
-              <w:top w:val="nil"/>
-              <w:left w:val="nil"/>
-              <w:bottom w:val="nil"/>
-              <w:right w:val="nil"/>
-            </w:tcBorders>
-          </w:tcPr>
-          <w:p>
-            <w:pPr>
-              <w:jc w:val="right"/>
-            </w:pPr>
-            <w:r>
-              <w:rPr>
-                <w:rFonts w:ascii="Times New Roman" w:hAnsi="Times New Roman"/>
-                <w:sz w:val="18"/>
-              </w:rPr>
-              <w:t>1422.2</w:t>
-            </w:r>
-          </w:p>
-        </w:tc>
-        <w:tc>
-          <w:tcPr>
-            <w:tcW w:type="dxa" w:w="1020"/>
-            <w:tcBorders>
-              <w:top w:val="nil"/>
-              <w:left w:val="nil"/>
-              <w:bottom w:val="nil"/>
-              <w:right w:val="nil"/>
-            </w:tcBorders>
-          </w:tcPr>
-          <w:p>
-            <w:pPr>
-              <w:jc w:val="right"/>
-            </w:pPr>
-            <w:r>
-              <w:rPr>
-                <w:rFonts w:ascii="Times New Roman" w:hAnsi="Times New Roman"/>
-                <w:sz w:val="18"/>
-              </w:rPr>
-              <w:t>931.2</w:t>
-            </w:r>
-          </w:p>
-        </w:tc>
-        <w:tc>
-          <w:tcPr>
-            <w:tcW w:type="dxa" w:w="1020"/>
-            <w:tcBorders>
-              <w:top w:val="nil"/>
-              <w:left w:val="nil"/>
-              <w:bottom w:val="nil"/>
-              <w:right w:val="nil"/>
-            </w:tcBorders>
-          </w:tcPr>
-          <w:p>
-            <w:pPr>
-              <w:jc w:val="right"/>
-            </w:pPr>
-            <w:r>
-              <w:rPr>
-                <w:rFonts w:ascii="Times New Roman" w:hAnsi="Times New Roman"/>
-                <w:sz w:val="18"/>
-              </w:rPr>
-              <w:t>584.0</w:t>
-            </w:r>
-          </w:p>
-        </w:tc>
-        <w:tc>
-          <w:tcPr>
-            <w:tcW w:type="dxa" w:w="1020"/>
-            <w:tcBorders>
-              <w:top w:val="nil"/>
-              <w:left w:val="nil"/>
-              <w:bottom w:val="nil"/>
-              <w:right w:val="nil"/>
-            </w:tcBorders>
-          </w:tcPr>
-          <w:p>
-            <w:pPr>
-              <w:jc w:val="right"/>
-            </w:pPr>
-            <w:r>
-              <w:rPr>
-                <w:rFonts w:ascii="Times New Roman" w:hAnsi="Times New Roman"/>
-                <w:sz w:val="18"/>
-              </w:rPr>
-              <w:t>5.231</w:t>
-            </w:r>
-          </w:p>
-        </w:tc>
-        <w:tc>
-          <w:tcPr>
-            <w:tcW w:type="dxa" w:w="1020"/>
-            <w:tcBorders>
-              <w:top w:val="nil"/>
-              <w:left w:val="nil"/>
-              <w:bottom w:val="nil"/>
-              <w:right w:val="nil"/>
-            </w:tcBorders>
-          </w:tcPr>
-          <w:p>
-            <w:pPr>
-              <w:jc w:val="right"/>
-            </w:pPr>
-            <w:r>
-              <w:rPr>
-                <w:rFonts w:ascii="Times New Roman" w:hAnsi="Times New Roman"/>
-                <w:sz w:val="18"/>
-              </w:rPr>
-              <w:t>111.7</w:t>
-            </w:r>
-          </w:p>
-        </w:tc>
-        <w:tc>
-          <w:tcPr>
-            <w:tcW w:type="dxa" w:w="1020"/>
-            <w:tcBorders>
-              <w:top w:val="nil"/>
-              <w:left w:val="nil"/>
-              <w:bottom w:val="nil"/>
-              <w:right w:val="nil"/>
-            </w:tcBorders>
-          </w:tcPr>
-          <w:p>
-            <w:pPr>
-              <w:jc w:val="right"/>
-            </w:pPr>
-            <w:r>
-              <w:rPr>
-                <w:rFonts w:ascii="Times New Roman" w:hAnsi="Times New Roman"/>
-                <w:sz w:val="18"/>
-              </w:rPr>
-              <w:t>0.1913</w:t>
-            </w:r>
-          </w:p>
-        </w:tc>
-        <w:tc>
-          <w:tcPr>
-            <w:tcW w:type="dxa" w:w="1020"/>
-            <w:tcBorders>
-              <w:top w:val="nil"/>
-              <w:left w:val="nil"/>
-              <w:bottom w:val="nil"/>
-              <w:right w:val="nil"/>
-            </w:tcBorders>
-          </w:tcPr>
-          <w:p>
-            <w:pPr>
-              <w:jc w:val="right"/>
-            </w:pPr>
-            <w:r>
-              <w:rPr>
-                <w:rFonts w:ascii="Times New Roman" w:hAnsi="Times New Roman"/>
-                <w:sz w:val="18"/>
-              </w:rPr>
-              <w:t>9.40</w:t>
-            </w:r>
-          </w:p>
-        </w:tc>
-        <w:tc>
-          <w:tcPr>
-            <w:tcW w:type="dxa" w:w="1020"/>
-            <w:tcBorders>
-              <w:top w:val="nil"/>
-              <w:left w:val="nil"/>
-              <w:bottom w:val="nil"/>
-              <w:right w:val="nil"/>
-            </w:tcBorders>
-          </w:tcPr>
-          <w:p>
-            <w:pPr>
-              <w:jc w:val="right"/>
-            </w:pPr>
-            <w:r>
-              <w:rPr>
-                <w:rFonts w:ascii="Times New Roman" w:hAnsi="Times New Roman"/>
-                <w:sz w:val="18"/>
-              </w:rPr>
-              <w:t>1.203</w:t>
-            </w:r>
-          </w:p>
-        </w:tc>
-        <w:tc>
-          <w:tcPr>
-            <w:tcW w:type="dxa" w:w="1020"/>
-            <w:tcBorders>
-              <w:top w:val="nil"/>
-              <w:left w:val="nil"/>
-              <w:bottom w:val="nil"/>
-              <w:right w:val="nil"/>
-            </w:tcBorders>
-          </w:tcPr>
-          <w:p>
-            <w:pPr>
-              <w:jc w:val="right"/>
-            </w:pPr>
-            <w:r>
-              <w:rPr>
-                <w:rFonts w:ascii="Times New Roman" w:hAnsi="Times New Roman"/>
-                <w:sz w:val="18"/>
-              </w:rPr>
-              <w:t>916.9</w:t>
-            </w:r>
-          </w:p>
-        </w:tc>
-        <w:tc>
-          <w:tcPr>
-            <w:tcW w:type="dxa" w:w="1020"/>
-            <w:tcBorders>
-              <w:top w:val="nil"/>
-              <w:left w:val="nil"/>
-              <w:bottom w:val="nil"/>
-              <w:right w:val="nil"/>
-            </w:tcBorders>
-          </w:tcPr>
-          <w:p>
-            <w:pPr>
-              <w:jc w:val="right"/>
-            </w:pPr>
-            <w:r>
-              <w:rPr>
-                <w:rFonts w:ascii="Times New Roman" w:hAnsi="Times New Roman"/>
-                <w:sz w:val="18"/>
-              </w:rPr>
-              <w:t>1.30</w:t>
             </w:r>
           </w:p>
         </w:tc>
@@ -1384,7 +1112,7 @@
                 <w:rFonts w:ascii="Times New Roman" w:hAnsi="Times New Roman"/>
                 <w:sz w:val="18"/>
               </w:rPr>
-              <w:t>m5_lambda_10b</w:t>
+              <w:t>m5_pure_10b</w:t>
             </w:r>
           </w:p>
         </w:tc>
@@ -1427,7 +1155,7 @@
                 <w:rFonts w:ascii="Times New Roman" w:hAnsi="Times New Roman"/>
                 <w:sz w:val="18"/>
               </w:rPr>
-              <w:t>1430.3</w:t>
+              <w:t>1428.6</w:t>
             </w:r>
           </w:p>
         </w:tc>
@@ -1450,7 +1178,7 @@
                 <w:rFonts w:ascii="Times New Roman" w:hAnsi="Times New Roman"/>
                 <w:sz w:val="18"/>
               </w:rPr>
-              <w:t>934.2</w:t>
+              <w:t>937.9</w:t>
             </w:r>
           </w:p>
         </w:tc>
@@ -1473,7 +1201,7 @@
                 <w:rFonts w:ascii="Times New Roman" w:hAnsi="Times New Roman"/>
                 <w:sz w:val="18"/>
               </w:rPr>
-              <w:t>588.1</w:t>
+              <w:t>593.9</w:t>
             </w:r>
           </w:p>
         </w:tc>
@@ -1496,7 +1224,7 @@
                 <w:rFonts w:ascii="Times New Roman" w:hAnsi="Times New Roman"/>
                 <w:sz w:val="18"/>
               </w:rPr>
-              <w:t>5.081</w:t>
+              <w:t>5.681</w:t>
             </w:r>
           </w:p>
         </w:tc>
@@ -1519,7 +1247,7 @@
                 <w:rFonts w:ascii="Times New Roman" w:hAnsi="Times New Roman"/>
                 <w:sz w:val="18"/>
               </w:rPr>
-              <w:t>115.8</w:t>
+              <w:t>104.6</w:t>
             </w:r>
           </w:p>
         </w:tc>
@@ -1542,7 +1270,7 @@
                 <w:rFonts w:ascii="Times New Roman" w:hAnsi="Times New Roman"/>
                 <w:sz w:val="18"/>
               </w:rPr>
-              <w:t>0.1970</w:t>
+              <w:t>0.1762</w:t>
             </w:r>
           </w:p>
         </w:tc>
@@ -1565,7 +1293,7 @@
                 <w:rFonts w:ascii="Times New Roman" w:hAnsi="Times New Roman"/>
                 <w:sz w:val="18"/>
               </w:rPr>
-              <w:t>10.18</w:t>
+              <w:t>10.26</w:t>
             </w:r>
           </w:p>
         </w:tc>
@@ -1588,7 +1316,7 @@
                 <w:rFonts w:ascii="Times New Roman" w:hAnsi="Times New Roman"/>
                 <w:sz w:val="18"/>
               </w:rPr>
-              <w:t>1.312</w:t>
+              <w:t>1.281</w:t>
             </w:r>
           </w:p>
         </w:tc>
@@ -1611,7 +1339,7 @@
                 <w:rFonts w:ascii="Times New Roman" w:hAnsi="Times New Roman"/>
                 <w:sz w:val="18"/>
               </w:rPr>
-              <w:t>955.2</w:t>
+              <w:t>902.2</w:t>
             </w:r>
           </w:p>
         </w:tc>
@@ -1634,7 +1362,279 @@
                 <w:rFonts w:ascii="Times New Roman" w:hAnsi="Times New Roman"/>
                 <w:sz w:val="18"/>
               </w:rPr>
-              <w:t>0.74</w:t>
+              <w:t>0.87</w:t>
+            </w:r>
+          </w:p>
+        </w:tc>
+      </w:tr>
+      <w:tr>
+        <w:tc>
+          <w:tcPr>
+            <w:tcW w:type="dxa" w:w="1020"/>
+            <w:tcBorders>
+              <w:top w:val="nil"/>
+              <w:left w:val="nil"/>
+              <w:bottom w:val="nil"/>
+              <w:right w:val="nil"/>
+            </w:tcBorders>
+          </w:tcPr>
+          <w:p>
+            <w:r>
+              <w:rPr>
+                <w:rFonts w:ascii="Times New Roman" w:hAnsi="Times New Roman"/>
+                <w:sz w:val="18"/>
+              </w:rPr>
+              <w:t>m1g_6b</w:t>
+            </w:r>
+          </w:p>
+        </w:tc>
+        <w:tc>
+          <w:tcPr>
+            <w:tcW w:type="dxa" w:w="1020"/>
+            <w:tcBorders>
+              <w:top w:val="nil"/>
+              <w:left w:val="nil"/>
+              <w:bottom w:val="nil"/>
+              <w:right w:val="nil"/>
+            </w:tcBorders>
+          </w:tcPr>
+          <w:p>
+            <w:r>
+              <w:rPr>
+                <w:rFonts w:ascii="Times New Roman" w:hAnsi="Times New Roman"/>
+                <w:sz w:val="18"/>
+              </w:rPr>
+              <w:t>6</w:t>
+            </w:r>
+          </w:p>
+        </w:tc>
+        <w:tc>
+          <w:tcPr>
+            <w:tcW w:type="dxa" w:w="1020"/>
+            <w:tcBorders>
+              <w:top w:val="nil"/>
+              <w:left w:val="nil"/>
+              <w:bottom w:val="nil"/>
+              <w:right w:val="nil"/>
+            </w:tcBorders>
+          </w:tcPr>
+          <w:p>
+            <w:pPr>
+              <w:jc w:val="right"/>
+            </w:pPr>
+            <w:r>
+              <w:rPr>
+                <w:rFonts w:ascii="Times New Roman" w:hAnsi="Times New Roman"/>
+                <w:sz w:val="18"/>
+              </w:rPr>
+              <w:t>1242.3</w:t>
+            </w:r>
+          </w:p>
+        </w:tc>
+        <w:tc>
+          <w:tcPr>
+            <w:tcW w:type="dxa" w:w="1020"/>
+            <w:tcBorders>
+              <w:top w:val="nil"/>
+              <w:left w:val="nil"/>
+              <w:bottom w:val="nil"/>
+              <w:right w:val="nil"/>
+            </w:tcBorders>
+          </w:tcPr>
+          <w:p>
+            <w:pPr>
+              <w:jc w:val="right"/>
+            </w:pPr>
+            <w:r>
+              <w:rPr>
+                <w:rFonts w:ascii="Times New Roman" w:hAnsi="Times New Roman"/>
+                <w:sz w:val="18"/>
+              </w:rPr>
+              <w:t>806.9</w:t>
+            </w:r>
+          </w:p>
+        </w:tc>
+        <w:tc>
+          <w:tcPr>
+            <w:tcW w:type="dxa" w:w="1020"/>
+            <w:tcBorders>
+              <w:top w:val="nil"/>
+              <w:left w:val="nil"/>
+              <w:bottom w:val="nil"/>
+              <w:right w:val="nil"/>
+            </w:tcBorders>
+          </w:tcPr>
+          <w:p>
+            <w:pPr>
+              <w:jc w:val="right"/>
+            </w:pPr>
+            <w:r>
+              <w:rPr>
+                <w:rFonts w:ascii="Times New Roman" w:hAnsi="Times New Roman"/>
+                <w:sz w:val="18"/>
+              </w:rPr>
+              <w:t>574.9</w:t>
+            </w:r>
+          </w:p>
+        </w:tc>
+        <w:tc>
+          <w:tcPr>
+            <w:tcW w:type="dxa" w:w="1020"/>
+            <w:tcBorders>
+              <w:top w:val="nil"/>
+              <w:left w:val="nil"/>
+              <w:bottom w:val="nil"/>
+              <w:right w:val="nil"/>
+            </w:tcBorders>
+          </w:tcPr>
+          <w:p>
+            <w:pPr>
+              <w:jc w:val="right"/>
+            </w:pPr>
+            <w:r>
+              <w:rPr>
+                <w:rFonts w:ascii="Times New Roman" w:hAnsi="Times New Roman"/>
+                <w:sz w:val="18"/>
+              </w:rPr>
+              <w:t>3.261</w:t>
+            </w:r>
+          </w:p>
+        </w:tc>
+        <w:tc>
+          <w:tcPr>
+            <w:tcW w:type="dxa" w:w="1020"/>
+            <w:tcBorders>
+              <w:top w:val="nil"/>
+              <w:left w:val="nil"/>
+              <w:bottom w:val="nil"/>
+              <w:right w:val="nil"/>
+            </w:tcBorders>
+          </w:tcPr>
+          <w:p>
+            <w:pPr>
+              <w:jc w:val="right"/>
+            </w:pPr>
+            <w:r>
+              <w:rPr>
+                <w:rFonts w:ascii="Times New Roman" w:hAnsi="Times New Roman"/>
+                <w:sz w:val="18"/>
+              </w:rPr>
+              <w:t>176.3</w:t>
+            </w:r>
+          </w:p>
+        </w:tc>
+        <w:tc>
+          <w:tcPr>
+            <w:tcW w:type="dxa" w:w="1020"/>
+            <w:tcBorders>
+              <w:top w:val="nil"/>
+              <w:left w:val="nil"/>
+              <w:bottom w:val="nil"/>
+              <w:right w:val="nil"/>
+            </w:tcBorders>
+          </w:tcPr>
+          <w:p>
+            <w:pPr>
+              <w:jc w:val="right"/>
+            </w:pPr>
+            <w:r>
+              <w:rPr>
+                <w:rFonts w:ascii="Times New Roman" w:hAnsi="Times New Roman"/>
+                <w:sz w:val="18"/>
+              </w:rPr>
+              <w:t>0.3068</w:t>
+            </w:r>
+          </w:p>
+        </w:tc>
+        <w:tc>
+          <w:tcPr>
+            <w:tcW w:type="dxa" w:w="1020"/>
+            <w:tcBorders>
+              <w:top w:val="nil"/>
+              <w:left w:val="nil"/>
+              <w:bottom w:val="nil"/>
+              <w:right w:val="nil"/>
+            </w:tcBorders>
+          </w:tcPr>
+          <w:p>
+            <w:pPr>
+              <w:jc w:val="right"/>
+            </w:pPr>
+            <w:r>
+              <w:rPr>
+                <w:rFonts w:ascii="Times New Roman" w:hAnsi="Times New Roman"/>
+                <w:sz w:val="18"/>
+              </w:rPr>
+              <w:t>14.86</w:t>
+            </w:r>
+          </w:p>
+        </w:tc>
+        <w:tc>
+          <w:tcPr>
+            <w:tcW w:type="dxa" w:w="1020"/>
+            <w:tcBorders>
+              <w:top w:val="nil"/>
+              <w:left w:val="nil"/>
+              <w:bottom w:val="nil"/>
+              <w:right w:val="nil"/>
+            </w:tcBorders>
+          </w:tcPr>
+          <w:p>
+            <w:pPr>
+              <w:jc w:val="right"/>
+            </w:pPr>
+            <w:r>
+              <w:rPr>
+                <w:rFonts w:ascii="Times New Roman" w:hAnsi="Times New Roman"/>
+                <w:sz w:val="18"/>
+              </w:rPr>
+              <w:t>1.696</w:t>
+            </w:r>
+          </w:p>
+        </w:tc>
+        <w:tc>
+          <w:tcPr>
+            <w:tcW w:type="dxa" w:w="1020"/>
+            <w:tcBorders>
+              <w:top w:val="nil"/>
+              <w:left w:val="nil"/>
+              <w:bottom w:val="nil"/>
+              <w:right w:val="nil"/>
+            </w:tcBorders>
+          </w:tcPr>
+          <w:p>
+            <w:pPr>
+              <w:jc w:val="right"/>
+            </w:pPr>
+            <w:r>
+              <w:rPr>
+                <w:rFonts w:ascii="Times New Roman" w:hAnsi="Times New Roman"/>
+                <w:sz w:val="18"/>
+              </w:rPr>
+              <w:t>324.5</w:t>
+            </w:r>
+          </w:p>
+        </w:tc>
+        <w:tc>
+          <w:tcPr>
+            <w:tcW w:type="dxa" w:w="1020"/>
+            <w:tcBorders>
+              <w:top w:val="nil"/>
+              <w:left w:val="nil"/>
+              <w:bottom w:val="nil"/>
+              <w:right w:val="nil"/>
+            </w:tcBorders>
+          </w:tcPr>
+          <w:p>
+            <w:pPr>
+              <w:jc w:val="right"/>
+            </w:pPr>
+            <w:r>
+              <w:rPr>
+                <w:rFonts w:ascii="Times New Roman" w:hAnsi="Times New Roman"/>
+                <w:sz w:val="18"/>
+              </w:rPr>
+              <w:t>13.78</w:t>
             </w:r>
           </w:p>
         </w:tc>
@@ -1656,7 +1656,7 @@
                 <w:rFonts w:ascii="Times New Roman" w:hAnsi="Times New Roman"/>
                 <w:sz w:val="18"/>
               </w:rPr>
-              <w:t>m5_pure_10b</w:t>
+              <w:t>m1g_10b</w:t>
             </w:r>
           </w:p>
         </w:tc>
@@ -1699,7 +1699,7 @@
                 <w:rFonts w:ascii="Times New Roman" w:hAnsi="Times New Roman"/>
                 <w:sz w:val="18"/>
               </w:rPr>
-              <w:t>1428.6</w:t>
+              <w:t>1415.6</w:t>
             </w:r>
           </w:p>
         </w:tc>
@@ -1722,7 +1722,7 @@
                 <w:rFonts w:ascii="Times New Roman" w:hAnsi="Times New Roman"/>
                 <w:sz w:val="18"/>
               </w:rPr>
-              <w:t>937.9</w:t>
+              <w:t>917.9</w:t>
             </w:r>
           </w:p>
         </w:tc>
@@ -1745,7 +1745,7 @@
                 <w:rFonts w:ascii="Times New Roman" w:hAnsi="Times New Roman"/>
                 <w:sz w:val="18"/>
               </w:rPr>
-              <w:t>593.9</w:t>
+              <w:t>642.7</w:t>
             </w:r>
           </w:p>
         </w:tc>
@@ -1768,7 +1768,7 @@
                 <w:rFonts w:ascii="Times New Roman" w:hAnsi="Times New Roman"/>
                 <w:sz w:val="18"/>
               </w:rPr>
-              <w:t>5.681</w:t>
+              <w:t>3.018</w:t>
             </w:r>
           </w:p>
         </w:tc>
@@ -1791,7 +1791,7 @@
                 <w:rFonts w:ascii="Times New Roman" w:hAnsi="Times New Roman"/>
                 <w:sz w:val="18"/>
               </w:rPr>
-              <w:t>104.6</w:t>
+              <w:t>213.1</w:t>
             </w:r>
           </w:p>
         </w:tc>
@@ -1814,7 +1814,7 @@
                 <w:rFonts w:ascii="Times New Roman" w:hAnsi="Times New Roman"/>
                 <w:sz w:val="18"/>
               </w:rPr>
-              <w:t>0.1762</w:t>
+              <w:t>0.3317</w:t>
             </w:r>
           </w:p>
         </w:tc>
@@ -1837,7 +1837,7 @@
                 <w:rFonts w:ascii="Times New Roman" w:hAnsi="Times New Roman"/>
                 <w:sz w:val="18"/>
               </w:rPr>
-              <w:t>10.26</w:t>
+              <w:t>16.77</w:t>
             </w:r>
           </w:p>
         </w:tc>
@@ -1860,7 +1860,7 @@
                 <w:rFonts w:ascii="Times New Roman" w:hAnsi="Times New Roman"/>
                 <w:sz w:val="18"/>
               </w:rPr>
-              <w:t>1.281</w:t>
+              <w:t>1.980</w:t>
             </w:r>
           </w:p>
         </w:tc>
@@ -1883,7 +1883,7 @@
                 <w:rFonts w:ascii="Times New Roman" w:hAnsi="Times New Roman"/>
                 <w:sz w:val="18"/>
               </w:rPr>
-              <w:t>902.2</w:t>
+              <w:t>373.6</w:t>
             </w:r>
           </w:p>
         </w:tc>
@@ -1906,7 +1906,7 @@
                 <w:rFonts w:ascii="Times New Roman" w:hAnsi="Times New Roman"/>
                 <w:sz w:val="18"/>
               </w:rPr>
-              <w:t>0.87</w:t>
+              <w:t>1.76</w:t>
             </w:r>
           </w:p>
         </w:tc>
@@ -1937,7 +1937,7 @@
         <w:rPr>
           <w:i/>
         </w:rPr>
-        <w:t>純貪婪 HGS-M5（無價格）在小規模是否仍忠實追隨 M4G（精確解）？ (Standard Deviations)</w:t>
+        <w:t>純貪婪 HGS-M5 在小規模對 M4G（精確解）與 M1G（Jiao 基準）的表現？（三臂） (Standard Deviations)</w:t>
       </w:r>
     </w:p>
     <w:tbl>
@@ -2469,278 +2469,6 @@
                 <w:sz w:val="18"/>
               </w:rPr>
               <w:t>0.47</w:t>
-            </w:r>
-          </w:p>
-        </w:tc>
-      </w:tr>
-      <w:tr>
-        <w:tc>
-          <w:tcPr>
-            <w:tcW w:type="dxa" w:w="1020"/>
-            <w:tcBorders>
-              <w:top w:val="nil"/>
-              <w:left w:val="nil"/>
-              <w:bottom w:val="nil"/>
-              <w:right w:val="nil"/>
-            </w:tcBorders>
-          </w:tcPr>
-          <w:p>
-            <w:r>
-              <w:rPr>
-                <w:rFonts w:ascii="Times New Roman" w:hAnsi="Times New Roman"/>
-                <w:sz w:val="18"/>
-              </w:rPr>
-              <w:t>m5_lambda_6b</w:t>
-            </w:r>
-          </w:p>
-        </w:tc>
-        <w:tc>
-          <w:tcPr>
-            <w:tcW w:type="dxa" w:w="1020"/>
-            <w:tcBorders>
-              <w:top w:val="nil"/>
-              <w:left w:val="nil"/>
-              <w:bottom w:val="nil"/>
-              <w:right w:val="nil"/>
-            </w:tcBorders>
-          </w:tcPr>
-          <w:p>
-            <w:r>
-              <w:rPr>
-                <w:rFonts w:ascii="Times New Roman" w:hAnsi="Times New Roman"/>
-                <w:sz w:val="18"/>
-              </w:rPr>
-              <w:t>6</w:t>
-            </w:r>
-          </w:p>
-        </w:tc>
-        <w:tc>
-          <w:tcPr>
-            <w:tcW w:type="dxa" w:w="1020"/>
-            <w:tcBorders>
-              <w:top w:val="nil"/>
-              <w:left w:val="nil"/>
-              <w:bottom w:val="nil"/>
-              <w:right w:val="nil"/>
-            </w:tcBorders>
-          </w:tcPr>
-          <w:p>
-            <w:pPr>
-              <w:jc w:val="right"/>
-            </w:pPr>
-            <w:r>
-              <w:rPr>
-                <w:rFonts w:ascii="Times New Roman" w:hAnsi="Times New Roman"/>
-                <w:sz w:val="18"/>
-              </w:rPr>
-              <w:t>4.6</w:t>
-            </w:r>
-          </w:p>
-        </w:tc>
-        <w:tc>
-          <w:tcPr>
-            <w:tcW w:type="dxa" w:w="1020"/>
-            <w:tcBorders>
-              <w:top w:val="nil"/>
-              <w:left w:val="nil"/>
-              <w:bottom w:val="nil"/>
-              <w:right w:val="nil"/>
-            </w:tcBorders>
-          </w:tcPr>
-          <w:p>
-            <w:pPr>
-              <w:jc w:val="right"/>
-            </w:pPr>
-            <w:r>
-              <w:rPr>
-                <w:rFonts w:ascii="Times New Roman" w:hAnsi="Times New Roman"/>
-                <w:sz w:val="18"/>
-              </w:rPr>
-              <w:t>12.0</w:t>
-            </w:r>
-          </w:p>
-        </w:tc>
-        <w:tc>
-          <w:tcPr>
-            <w:tcW w:type="dxa" w:w="1020"/>
-            <w:tcBorders>
-              <w:top w:val="nil"/>
-              <w:left w:val="nil"/>
-              <w:bottom w:val="nil"/>
-              <w:right w:val="nil"/>
-            </w:tcBorders>
-          </w:tcPr>
-          <w:p>
-            <w:pPr>
-              <w:jc w:val="right"/>
-            </w:pPr>
-            <w:r>
-              <w:rPr>
-                <w:rFonts w:ascii="Times New Roman" w:hAnsi="Times New Roman"/>
-                <w:sz w:val="18"/>
-              </w:rPr>
-              <w:t>11.1</w:t>
-            </w:r>
-          </w:p>
-        </w:tc>
-        <w:tc>
-          <w:tcPr>
-            <w:tcW w:type="dxa" w:w="1020"/>
-            <w:tcBorders>
-              <w:top w:val="nil"/>
-              <w:left w:val="nil"/>
-              <w:bottom w:val="nil"/>
-              <w:right w:val="nil"/>
-            </w:tcBorders>
-          </w:tcPr>
-          <w:p>
-            <w:pPr>
-              <w:jc w:val="right"/>
-            </w:pPr>
-            <w:r>
-              <w:rPr>
-                <w:rFonts w:ascii="Times New Roman" w:hAnsi="Times New Roman"/>
-                <w:sz w:val="18"/>
-              </w:rPr>
-              <w:t>0.113</w:t>
-            </w:r>
-          </w:p>
-        </w:tc>
-        <w:tc>
-          <w:tcPr>
-            <w:tcW w:type="dxa" w:w="1020"/>
-            <w:tcBorders>
-              <w:top w:val="nil"/>
-              <w:left w:val="nil"/>
-              <w:bottom w:val="nil"/>
-              <w:right w:val="nil"/>
-            </w:tcBorders>
-          </w:tcPr>
-          <w:p>
-            <w:pPr>
-              <w:jc w:val="right"/>
-            </w:pPr>
-            <w:r>
-              <w:rPr>
-                <w:rFonts w:ascii="Times New Roman" w:hAnsi="Times New Roman"/>
-                <w:sz w:val="18"/>
-              </w:rPr>
-              <w:t>3.4</w:t>
-            </w:r>
-          </w:p>
-        </w:tc>
-        <w:tc>
-          <w:tcPr>
-            <w:tcW w:type="dxa" w:w="1020"/>
-            <w:tcBorders>
-              <w:top w:val="nil"/>
-              <w:left w:val="nil"/>
-              <w:bottom w:val="nil"/>
-              <w:right w:val="nil"/>
-            </w:tcBorders>
-          </w:tcPr>
-          <w:p>
-            <w:pPr>
-              <w:jc w:val="right"/>
-            </w:pPr>
-            <w:r>
-              <w:rPr>
-                <w:rFonts w:ascii="Times New Roman" w:hAnsi="Times New Roman"/>
-                <w:sz w:val="18"/>
-              </w:rPr>
-              <w:t>0.0042</w:t>
-            </w:r>
-          </w:p>
-        </w:tc>
-        <w:tc>
-          <w:tcPr>
-            <w:tcW w:type="dxa" w:w="1020"/>
-            <w:tcBorders>
-              <w:top w:val="nil"/>
-              <w:left w:val="nil"/>
-              <w:bottom w:val="nil"/>
-              <w:right w:val="nil"/>
-            </w:tcBorders>
-          </w:tcPr>
-          <w:p>
-            <w:pPr>
-              <w:jc w:val="right"/>
-            </w:pPr>
-            <w:r>
-              <w:rPr>
-                <w:rFonts w:ascii="Times New Roman" w:hAnsi="Times New Roman"/>
-                <w:sz w:val="18"/>
-              </w:rPr>
-              <w:t>0.23</w:t>
-            </w:r>
-          </w:p>
-        </w:tc>
-        <w:tc>
-          <w:tcPr>
-            <w:tcW w:type="dxa" w:w="1020"/>
-            <w:tcBorders>
-              <w:top w:val="nil"/>
-              <w:left w:val="nil"/>
-              <w:bottom w:val="nil"/>
-              <w:right w:val="nil"/>
-            </w:tcBorders>
-          </w:tcPr>
-          <w:p>
-            <w:pPr>
-              <w:jc w:val="right"/>
-            </w:pPr>
-            <w:r>
-              <w:rPr>
-                <w:rFonts w:ascii="Times New Roman" w:hAnsi="Times New Roman"/>
-                <w:sz w:val="18"/>
-              </w:rPr>
-              <w:t>0.023</w:t>
-            </w:r>
-          </w:p>
-        </w:tc>
-        <w:tc>
-          <w:tcPr>
-            <w:tcW w:type="dxa" w:w="1020"/>
-            <w:tcBorders>
-              <w:top w:val="nil"/>
-              <w:left w:val="nil"/>
-              <w:bottom w:val="nil"/>
-              <w:right w:val="nil"/>
-            </w:tcBorders>
-          </w:tcPr>
-          <w:p>
-            <w:pPr>
-              <w:jc w:val="right"/>
-            </w:pPr>
-            <w:r>
-              <w:rPr>
-                <w:rFonts w:ascii="Times New Roman" w:hAnsi="Times New Roman"/>
-                <w:sz w:val="18"/>
-              </w:rPr>
-              <w:t>64.2</w:t>
-            </w:r>
-          </w:p>
-        </w:tc>
-        <w:tc>
-          <w:tcPr>
-            <w:tcW w:type="dxa" w:w="1020"/>
-            <w:tcBorders>
-              <w:top w:val="nil"/>
-              <w:left w:val="nil"/>
-              <w:bottom w:val="nil"/>
-              <w:right w:val="nil"/>
-            </w:tcBorders>
-          </w:tcPr>
-          <w:p>
-            <w:pPr>
-              <w:jc w:val="right"/>
-            </w:pPr>
-            <w:r>
-              <w:rPr>
-                <w:rFonts w:ascii="Times New Roman" w:hAnsi="Times New Roman"/>
-                <w:sz w:val="18"/>
-              </w:rPr>
-              <w:t>0.29</w:t>
             </w:r>
           </w:p>
         </w:tc>
@@ -3306,7 +3034,7 @@
                 <w:rFonts w:ascii="Times New Roman" w:hAnsi="Times New Roman"/>
                 <w:sz w:val="18"/>
               </w:rPr>
-              <w:t>m5_lambda_10b</w:t>
+              <w:t>m5_pure_10b</w:t>
             </w:r>
           </w:p>
         </w:tc>
@@ -3349,7 +3077,7 @@
                 <w:rFonts w:ascii="Times New Roman" w:hAnsi="Times New Roman"/>
                 <w:sz w:val="18"/>
               </w:rPr>
-              <w:t>0.7</w:t>
+              <w:t>0.5</w:t>
             </w:r>
           </w:p>
         </w:tc>
@@ -3372,7 +3100,7 @@
                 <w:rFonts w:ascii="Times New Roman" w:hAnsi="Times New Roman"/>
                 <w:sz w:val="18"/>
               </w:rPr>
-              <w:t>14.6</w:t>
+              <w:t>12.6</w:t>
             </w:r>
           </w:p>
         </w:tc>
@@ -3395,7 +3123,7 @@
                 <w:rFonts w:ascii="Times New Roman" w:hAnsi="Times New Roman"/>
                 <w:sz w:val="18"/>
               </w:rPr>
-              <w:t>13.7</w:t>
+              <w:t>12.9</w:t>
             </w:r>
           </w:p>
         </w:tc>
@@ -3418,7 +3146,7 @@
                 <w:rFonts w:ascii="Times New Roman" w:hAnsi="Times New Roman"/>
                 <w:sz w:val="18"/>
               </w:rPr>
-              <w:t>0.137</w:t>
+              <w:t>0.178</w:t>
             </w:r>
           </w:p>
         </w:tc>
@@ -3464,7 +3192,7 @@
                 <w:rFonts w:ascii="Times New Roman" w:hAnsi="Times New Roman"/>
                 <w:sz w:val="18"/>
               </w:rPr>
-              <w:t>0.0053</w:t>
+              <w:t>0.0055</w:t>
             </w:r>
           </w:p>
         </w:tc>
@@ -3487,7 +3215,7 @@
                 <w:rFonts w:ascii="Times New Roman" w:hAnsi="Times New Roman"/>
                 <w:sz w:val="18"/>
               </w:rPr>
-              <w:t>0.28</w:t>
+              <w:t>0.30</w:t>
             </w:r>
           </w:p>
         </w:tc>
@@ -3510,7 +3238,7 @@
                 <w:rFonts w:ascii="Times New Roman" w:hAnsi="Times New Roman"/>
                 <w:sz w:val="18"/>
               </w:rPr>
-              <w:t>0.035</w:t>
+              <w:t>0.042</w:t>
             </w:r>
           </w:p>
         </w:tc>
@@ -3533,7 +3261,7 @@
                 <w:rFonts w:ascii="Times New Roman" w:hAnsi="Times New Roman"/>
                 <w:sz w:val="18"/>
               </w:rPr>
-              <w:t>59.8</w:t>
+              <w:t>85.4</w:t>
             </w:r>
           </w:p>
         </w:tc>
@@ -3568,6 +3296,278 @@
             <w:tcBorders>
               <w:top w:val="nil"/>
               <w:left w:val="nil"/>
+              <w:bottom w:val="nil"/>
+              <w:right w:val="nil"/>
+            </w:tcBorders>
+          </w:tcPr>
+          <w:p>
+            <w:r>
+              <w:rPr>
+                <w:rFonts w:ascii="Times New Roman" w:hAnsi="Times New Roman"/>
+                <w:sz w:val="18"/>
+              </w:rPr>
+              <w:t>m1g_6b</w:t>
+            </w:r>
+          </w:p>
+        </w:tc>
+        <w:tc>
+          <w:tcPr>
+            <w:tcW w:type="dxa" w:w="1020"/>
+            <w:tcBorders>
+              <w:top w:val="nil"/>
+              <w:left w:val="nil"/>
+              <w:bottom w:val="nil"/>
+              <w:right w:val="nil"/>
+            </w:tcBorders>
+          </w:tcPr>
+          <w:p>
+            <w:r>
+              <w:rPr>
+                <w:rFonts w:ascii="Times New Roman" w:hAnsi="Times New Roman"/>
+                <w:sz w:val="18"/>
+              </w:rPr>
+              <w:t>6</w:t>
+            </w:r>
+          </w:p>
+        </w:tc>
+        <w:tc>
+          <w:tcPr>
+            <w:tcW w:type="dxa" w:w="1020"/>
+            <w:tcBorders>
+              <w:top w:val="nil"/>
+              <w:left w:val="nil"/>
+              <w:bottom w:val="nil"/>
+              <w:right w:val="nil"/>
+            </w:tcBorders>
+          </w:tcPr>
+          <w:p>
+            <w:pPr>
+              <w:jc w:val="right"/>
+            </w:pPr>
+            <w:r>
+              <w:rPr>
+                <w:rFonts w:ascii="Times New Roman" w:hAnsi="Times New Roman"/>
+                <w:sz w:val="18"/>
+              </w:rPr>
+              <w:t>26.0</w:t>
+            </w:r>
+          </w:p>
+        </w:tc>
+        <w:tc>
+          <w:tcPr>
+            <w:tcW w:type="dxa" w:w="1020"/>
+            <w:tcBorders>
+              <w:top w:val="nil"/>
+              <w:left w:val="nil"/>
+              <w:bottom w:val="nil"/>
+              <w:right w:val="nil"/>
+            </w:tcBorders>
+          </w:tcPr>
+          <w:p>
+            <w:pPr>
+              <w:jc w:val="right"/>
+            </w:pPr>
+            <w:r>
+              <w:rPr>
+                <w:rFonts w:ascii="Times New Roman" w:hAnsi="Times New Roman"/>
+                <w:sz w:val="18"/>
+              </w:rPr>
+              <w:t>22.3</w:t>
+            </w:r>
+          </w:p>
+        </w:tc>
+        <w:tc>
+          <w:tcPr>
+            <w:tcW w:type="dxa" w:w="1020"/>
+            <w:tcBorders>
+              <w:top w:val="nil"/>
+              <w:left w:val="nil"/>
+              <w:bottom w:val="nil"/>
+              <w:right w:val="nil"/>
+            </w:tcBorders>
+          </w:tcPr>
+          <w:p>
+            <w:pPr>
+              <w:jc w:val="right"/>
+            </w:pPr>
+            <w:r>
+              <w:rPr>
+                <w:rFonts w:ascii="Times New Roman" w:hAnsi="Times New Roman"/>
+                <w:sz w:val="18"/>
+              </w:rPr>
+              <w:t>17.0</w:t>
+            </w:r>
+          </w:p>
+        </w:tc>
+        <w:tc>
+          <w:tcPr>
+            <w:tcW w:type="dxa" w:w="1020"/>
+            <w:tcBorders>
+              <w:top w:val="nil"/>
+              <w:left w:val="nil"/>
+              <w:bottom w:val="nil"/>
+              <w:right w:val="nil"/>
+            </w:tcBorders>
+          </w:tcPr>
+          <w:p>
+            <w:pPr>
+              <w:jc w:val="right"/>
+            </w:pPr>
+            <w:r>
+              <w:rPr>
+                <w:rFonts w:ascii="Times New Roman" w:hAnsi="Times New Roman"/>
+                <w:sz w:val="18"/>
+              </w:rPr>
+              <w:t>0.075</w:t>
+            </w:r>
+          </w:p>
+        </w:tc>
+        <w:tc>
+          <w:tcPr>
+            <w:tcW w:type="dxa" w:w="1020"/>
+            <w:tcBorders>
+              <w:top w:val="nil"/>
+              <w:left w:val="nil"/>
+              <w:bottom w:val="nil"/>
+              <w:right w:val="nil"/>
+            </w:tcBorders>
+          </w:tcPr>
+          <w:p>
+            <w:pPr>
+              <w:jc w:val="right"/>
+            </w:pPr>
+            <w:r>
+              <w:rPr>
+                <w:rFonts w:ascii="Times New Roman" w:hAnsi="Times New Roman"/>
+                <w:sz w:val="18"/>
+              </w:rPr>
+              <w:t>2.9</w:t>
+            </w:r>
+          </w:p>
+        </w:tc>
+        <w:tc>
+          <w:tcPr>
+            <w:tcW w:type="dxa" w:w="1020"/>
+            <w:tcBorders>
+              <w:top w:val="nil"/>
+              <w:left w:val="nil"/>
+              <w:bottom w:val="nil"/>
+              <w:right w:val="nil"/>
+            </w:tcBorders>
+          </w:tcPr>
+          <w:p>
+            <w:pPr>
+              <w:jc w:val="right"/>
+            </w:pPr>
+            <w:r>
+              <w:rPr>
+                <w:rFonts w:ascii="Times New Roman" w:hAnsi="Times New Roman"/>
+                <w:sz w:val="18"/>
+              </w:rPr>
+              <w:t>0.0070</w:t>
+            </w:r>
+          </w:p>
+        </w:tc>
+        <w:tc>
+          <w:tcPr>
+            <w:tcW w:type="dxa" w:w="1020"/>
+            <w:tcBorders>
+              <w:top w:val="nil"/>
+              <w:left w:val="nil"/>
+              <w:bottom w:val="nil"/>
+              <w:right w:val="nil"/>
+            </w:tcBorders>
+          </w:tcPr>
+          <w:p>
+            <w:pPr>
+              <w:jc w:val="right"/>
+            </w:pPr>
+            <w:r>
+              <w:rPr>
+                <w:rFonts w:ascii="Times New Roman" w:hAnsi="Times New Roman"/>
+                <w:sz w:val="18"/>
+              </w:rPr>
+              <w:t>0.31</w:t>
+            </w:r>
+          </w:p>
+        </w:tc>
+        <w:tc>
+          <w:tcPr>
+            <w:tcW w:type="dxa" w:w="1020"/>
+            <w:tcBorders>
+              <w:top w:val="nil"/>
+              <w:left w:val="nil"/>
+              <w:bottom w:val="nil"/>
+              <w:right w:val="nil"/>
+            </w:tcBorders>
+          </w:tcPr>
+          <w:p>
+            <w:pPr>
+              <w:jc w:val="right"/>
+            </w:pPr>
+            <w:r>
+              <w:rPr>
+                <w:rFonts w:ascii="Times New Roman" w:hAnsi="Times New Roman"/>
+                <w:sz w:val="18"/>
+              </w:rPr>
+              <w:t>0.043</w:t>
+            </w:r>
+          </w:p>
+        </w:tc>
+        <w:tc>
+          <w:tcPr>
+            <w:tcW w:type="dxa" w:w="1020"/>
+            <w:tcBorders>
+              <w:top w:val="nil"/>
+              <w:left w:val="nil"/>
+              <w:bottom w:val="nil"/>
+              <w:right w:val="nil"/>
+            </w:tcBorders>
+          </w:tcPr>
+          <w:p>
+            <w:pPr>
+              <w:jc w:val="right"/>
+            </w:pPr>
+            <w:r>
+              <w:rPr>
+                <w:rFonts w:ascii="Times New Roman" w:hAnsi="Times New Roman"/>
+                <w:sz w:val="18"/>
+              </w:rPr>
+              <w:t>12.8</w:t>
+            </w:r>
+          </w:p>
+        </w:tc>
+        <w:tc>
+          <w:tcPr>
+            <w:tcW w:type="dxa" w:w="1020"/>
+            <w:tcBorders>
+              <w:top w:val="nil"/>
+              <w:left w:val="nil"/>
+              <w:bottom w:val="nil"/>
+              <w:right w:val="nil"/>
+            </w:tcBorders>
+          </w:tcPr>
+          <w:p>
+            <w:pPr>
+              <w:jc w:val="right"/>
+            </w:pPr>
+            <w:r>
+              <w:rPr>
+                <w:rFonts w:ascii="Times New Roman" w:hAnsi="Times New Roman"/>
+                <w:sz w:val="18"/>
+              </w:rPr>
+              <w:t>1.80</w:t>
+            </w:r>
+          </w:p>
+        </w:tc>
+      </w:tr>
+      <w:tr>
+        <w:tc>
+          <w:tcPr>
+            <w:tcW w:type="dxa" w:w="1020"/>
+            <w:tcBorders>
+              <w:top w:val="nil"/>
+              <w:left w:val="nil"/>
               <w:bottom w:val="single" w:sz="8" w:color="000000"/>
               <w:right w:val="nil"/>
             </w:tcBorders>
@@ -3578,7 +3578,7 @@
                 <w:rFonts w:ascii="Times New Roman" w:hAnsi="Times New Roman"/>
                 <w:sz w:val="18"/>
               </w:rPr>
-              <w:t>m5_pure_10b</w:t>
+              <w:t>m1g_10b</w:t>
             </w:r>
           </w:p>
         </w:tc>
@@ -3621,7 +3621,7 @@
                 <w:rFonts w:ascii="Times New Roman" w:hAnsi="Times New Roman"/>
                 <w:sz w:val="18"/>
               </w:rPr>
-              <w:t>0.5</w:t>
+              <w:t>15.8</w:t>
             </w:r>
           </w:p>
         </w:tc>
@@ -3644,7 +3644,7 @@
                 <w:rFonts w:ascii="Times New Roman" w:hAnsi="Times New Roman"/>
                 <w:sz w:val="18"/>
               </w:rPr>
-              <w:t>12.6</w:t>
+              <w:t>16.8</w:t>
             </w:r>
           </w:p>
         </w:tc>
@@ -3667,7 +3667,7 @@
                 <w:rFonts w:ascii="Times New Roman" w:hAnsi="Times New Roman"/>
                 <w:sz w:val="18"/>
               </w:rPr>
-              <w:t>12.9</w:t>
+              <w:t>12.5</w:t>
             </w:r>
           </w:p>
         </w:tc>
@@ -3690,7 +3690,7 @@
                 <w:rFonts w:ascii="Times New Roman" w:hAnsi="Times New Roman"/>
                 <w:sz w:val="18"/>
               </w:rPr>
-              <w:t>0.178</w:t>
+              <w:t>0.090</w:t>
             </w:r>
           </w:p>
         </w:tc>
@@ -3713,7 +3713,7 @@
                 <w:rFonts w:ascii="Times New Roman" w:hAnsi="Times New Roman"/>
                 <w:sz w:val="18"/>
               </w:rPr>
-              <w:t>3.1</w:t>
+              <w:t>5.3</w:t>
             </w:r>
           </w:p>
         </w:tc>
@@ -3736,7 +3736,7 @@
                 <w:rFonts w:ascii="Times New Roman" w:hAnsi="Times New Roman"/>
                 <w:sz w:val="18"/>
               </w:rPr>
-              <w:t>0.0055</w:t>
+              <w:t>0.0103</w:t>
             </w:r>
           </w:p>
         </w:tc>
@@ -3759,7 +3759,7 @@
                 <w:rFonts w:ascii="Times New Roman" w:hAnsi="Times New Roman"/>
                 <w:sz w:val="18"/>
               </w:rPr>
-              <w:t>0.30</w:t>
+              <w:t>0.59</w:t>
             </w:r>
           </w:p>
         </w:tc>
@@ -3782,7 +3782,7 @@
                 <w:rFonts w:ascii="Times New Roman" w:hAnsi="Times New Roman"/>
                 <w:sz w:val="18"/>
               </w:rPr>
-              <w:t>0.042</w:t>
+              <w:t>0.063</w:t>
             </w:r>
           </w:p>
         </w:tc>
@@ -3805,7 +3805,7 @@
                 <w:rFonts w:ascii="Times New Roman" w:hAnsi="Times New Roman"/>
                 <w:sz w:val="18"/>
               </w:rPr>
-              <w:t>85.4</w:t>
+              <w:t>21.6</w:t>
             </w:r>
           </w:p>
         </w:tc>
@@ -3828,7 +3828,7 @@
                 <w:rFonts w:ascii="Times New Roman" w:hAnsi="Times New Roman"/>
                 <w:sz w:val="18"/>
               </w:rPr>
-              <w:t>0.02</w:t>
+              <w:t>1.11</w:t>
             </w:r>
           </w:p>
         </w:tc>
@@ -4391,7 +4391,7 @@
             <w:tcBorders>
               <w:top w:val="nil"/>
               <w:left w:val="nil"/>
-              <w:bottom w:val="single" w:sz="8" w:color="000000"/>
+              <w:bottom w:val="nil"/>
               <w:right w:val="nil"/>
             </w:tcBorders>
           </w:tcPr>
@@ -4405,6 +4405,1074 @@
             </w:r>
           </w:p>
         </w:tc>
+        <w:tc>
+          <w:tcPr>
+            <w:tcW w:type="dxa" w:w="1020"/>
+            <w:tcBorders>
+              <w:top w:val="nil"/>
+              <w:left w:val="nil"/>
+              <w:bottom w:val="nil"/>
+              <w:right w:val="nil"/>
+            </w:tcBorders>
+          </w:tcPr>
+          <w:p>
+            <w:r>
+              <w:rPr>
+                <w:rFonts w:ascii="Times New Roman" w:hAnsi="Times New Roman"/>
+                <w:sz w:val="18"/>
+              </w:rPr>
+              <w:t>m4g_10b</w:t>
+            </w:r>
+          </w:p>
+        </w:tc>
+        <w:tc>
+          <w:tcPr>
+            <w:tcW w:type="dxa" w:w="1020"/>
+            <w:tcBorders>
+              <w:top w:val="nil"/>
+              <w:left w:val="nil"/>
+              <w:bottom w:val="nil"/>
+              <w:right w:val="nil"/>
+            </w:tcBorders>
+          </w:tcPr>
+          <w:p>
+            <w:pPr>
+              <w:jc w:val="right"/>
+            </w:pPr>
+            <w:r>
+              <w:rPr>
+                <w:rFonts w:ascii="Times New Roman" w:hAnsi="Times New Roman"/>
+                <w:sz w:val="18"/>
+              </w:rPr>
+              <w:t>−0.01</w:t>
+            </w:r>
+          </w:p>
+        </w:tc>
+        <w:tc>
+          <w:tcPr>
+            <w:tcW w:type="dxa" w:w="1020"/>
+            <w:tcBorders>
+              <w:top w:val="nil"/>
+              <w:left w:val="nil"/>
+              <w:bottom w:val="nil"/>
+              <w:right w:val="nil"/>
+            </w:tcBorders>
+          </w:tcPr>
+          <w:p>
+            <w:pPr>
+              <w:jc w:val="right"/>
+            </w:pPr>
+            <w:r>
+              <w:rPr>
+                <w:rFonts w:ascii="Times New Roman" w:hAnsi="Times New Roman"/>
+                <w:sz w:val="18"/>
+              </w:rPr>
+              <w:t>−1.50**</w:t>
+            </w:r>
+          </w:p>
+        </w:tc>
+        <w:tc>
+          <w:tcPr>
+            <w:tcW w:type="dxa" w:w="1020"/>
+            <w:tcBorders>
+              <w:top w:val="nil"/>
+              <w:left w:val="nil"/>
+              <w:bottom w:val="nil"/>
+              <w:right w:val="nil"/>
+            </w:tcBorders>
+          </w:tcPr>
+          <w:p>
+            <w:pPr>
+              <w:jc w:val="right"/>
+            </w:pPr>
+            <w:r>
+              <w:rPr>
+                <w:rFonts w:ascii="Times New Roman" w:hAnsi="Times New Roman"/>
+                <w:sz w:val="18"/>
+              </w:rPr>
+              <w:t>−1.59*</w:t>
+            </w:r>
+          </w:p>
+        </w:tc>
+        <w:tc>
+          <w:tcPr>
+            <w:tcW w:type="dxa" w:w="1020"/>
+            <w:tcBorders>
+              <w:top w:val="nil"/>
+              <w:left w:val="nil"/>
+              <w:bottom w:val="nil"/>
+              <w:right w:val="nil"/>
+            </w:tcBorders>
+          </w:tcPr>
+          <w:p>
+            <w:pPr>
+              <w:jc w:val="right"/>
+            </w:pPr>
+            <w:r>
+              <w:rPr>
+                <w:rFonts w:ascii="Times New Roman" w:hAnsi="Times New Roman"/>
+                <w:sz w:val="18"/>
+              </w:rPr>
+              <w:t>+11.02***</w:t>
+            </w:r>
+          </w:p>
+        </w:tc>
+        <w:tc>
+          <w:tcPr>
+            <w:tcW w:type="dxa" w:w="1020"/>
+            <w:tcBorders>
+              <w:top w:val="nil"/>
+              <w:left w:val="nil"/>
+              <w:bottom w:val="nil"/>
+              <w:right w:val="nil"/>
+            </w:tcBorders>
+          </w:tcPr>
+          <w:p>
+            <w:pPr>
+              <w:jc w:val="right"/>
+            </w:pPr>
+            <w:r>
+              <w:rPr>
+                <w:rFonts w:ascii="Times New Roman" w:hAnsi="Times New Roman"/>
+                <w:sz w:val="18"/>
+              </w:rPr>
+              <w:t>−11.36***</w:t>
+            </w:r>
+          </w:p>
+        </w:tc>
+        <w:tc>
+          <w:tcPr>
+            <w:tcW w:type="dxa" w:w="1020"/>
+            <w:tcBorders>
+              <w:top w:val="nil"/>
+              <w:left w:val="nil"/>
+              <w:bottom w:val="nil"/>
+              <w:right w:val="nil"/>
+            </w:tcBorders>
+          </w:tcPr>
+          <w:p>
+            <w:pPr>
+              <w:jc w:val="right"/>
+            </w:pPr>
+            <w:r>
+              <w:rPr>
+                <w:rFonts w:ascii="Times New Roman" w:hAnsi="Times New Roman"/>
+                <w:sz w:val="18"/>
+              </w:rPr>
+              <w:t>−9.92***</w:t>
+            </w:r>
+          </w:p>
+        </w:tc>
+        <w:tc>
+          <w:tcPr>
+            <w:tcW w:type="dxa" w:w="1020"/>
+            <w:tcBorders>
+              <w:top w:val="nil"/>
+              <w:left w:val="nil"/>
+              <w:bottom w:val="nil"/>
+              <w:right w:val="nil"/>
+            </w:tcBorders>
+          </w:tcPr>
+          <w:p>
+            <w:pPr>
+              <w:jc w:val="right"/>
+            </w:pPr>
+            <w:r>
+              <w:rPr>
+                <w:rFonts w:ascii="Times New Roman" w:hAnsi="Times New Roman"/>
+                <w:sz w:val="18"/>
+              </w:rPr>
+              <w:t>−0.90</w:t>
+            </w:r>
+          </w:p>
+        </w:tc>
+        <w:tc>
+          <w:tcPr>
+            <w:tcW w:type="dxa" w:w="1020"/>
+            <w:tcBorders>
+              <w:top w:val="nil"/>
+              <w:left w:val="nil"/>
+              <w:bottom w:val="nil"/>
+              <w:right w:val="nil"/>
+            </w:tcBorders>
+          </w:tcPr>
+          <w:p>
+            <w:pPr>
+              <w:jc w:val="right"/>
+            </w:pPr>
+            <w:r>
+              <w:rPr>
+                <w:rFonts w:ascii="Times New Roman" w:hAnsi="Times New Roman"/>
+                <w:sz w:val="18"/>
+              </w:rPr>
+              <w:t>−2.76*</w:t>
+            </w:r>
+          </w:p>
+        </w:tc>
+        <w:tc>
+          <w:tcPr>
+            <w:tcW w:type="dxa" w:w="1020"/>
+            <w:tcBorders>
+              <w:top w:val="nil"/>
+              <w:left w:val="nil"/>
+              <w:bottom w:val="nil"/>
+              <w:right w:val="nil"/>
+            </w:tcBorders>
+          </w:tcPr>
+          <w:p>
+            <w:pPr>
+              <w:jc w:val="right"/>
+            </w:pPr>
+            <w:r>
+              <w:rPr>
+                <w:rFonts w:ascii="Times New Roman" w:hAnsi="Times New Roman"/>
+                <w:sz w:val="18"/>
+              </w:rPr>
+              <w:t>+14.52**</w:t>
+            </w:r>
+          </w:p>
+        </w:tc>
+        <w:tc>
+          <w:tcPr>
+            <w:tcW w:type="dxa" w:w="1020"/>
+            <w:tcBorders>
+              <w:top w:val="nil"/>
+              <w:left w:val="nil"/>
+              <w:bottom w:val="nil"/>
+              <w:right w:val="nil"/>
+            </w:tcBorders>
+          </w:tcPr>
+          <w:p>
+            <w:pPr>
+              <w:jc w:val="right"/>
+            </w:pPr>
+            <w:r>
+              <w:rPr>
+                <w:rFonts w:ascii="Times New Roman" w:hAnsi="Times New Roman"/>
+                <w:sz w:val="18"/>
+              </w:rPr>
+              <w:t>+1.27</w:t>
+            </w:r>
+          </w:p>
+        </w:tc>
+      </w:tr>
+      <w:tr>
+        <w:tc>
+          <w:tcPr>
+            <w:tcW w:type="dxa" w:w="1020"/>
+            <w:tcBorders>
+              <w:top w:val="nil"/>
+              <w:left w:val="nil"/>
+              <w:bottom w:val="nil"/>
+              <w:right w:val="nil"/>
+            </w:tcBorders>
+          </w:tcPr>
+          <w:p>
+            <w:r>
+              <w:rPr>
+                <w:rFonts w:ascii="Times New Roman" w:hAnsi="Times New Roman"/>
+                <w:sz w:val="18"/>
+              </w:rPr>
+              <w:t>m5_pure_6b</w:t>
+            </w:r>
+          </w:p>
+        </w:tc>
+        <w:tc>
+          <w:tcPr>
+            <w:tcW w:type="dxa" w:w="1020"/>
+            <w:tcBorders>
+              <w:top w:val="nil"/>
+              <w:left w:val="nil"/>
+              <w:bottom w:val="nil"/>
+              <w:right w:val="nil"/>
+            </w:tcBorders>
+          </w:tcPr>
+          <w:p>
+            <w:r>
+              <w:rPr>
+                <w:rFonts w:ascii="Times New Roman" w:hAnsi="Times New Roman"/>
+                <w:sz w:val="18"/>
+              </w:rPr>
+              <w:t>m1g_6b</w:t>
+            </w:r>
+          </w:p>
+        </w:tc>
+        <w:tc>
+          <w:tcPr>
+            <w:tcW w:type="dxa" w:w="1020"/>
+            <w:tcBorders>
+              <w:top w:val="nil"/>
+              <w:left w:val="nil"/>
+              <w:bottom w:val="nil"/>
+              <w:right w:val="nil"/>
+            </w:tcBorders>
+          </w:tcPr>
+          <w:p>
+            <w:pPr>
+              <w:jc w:val="right"/>
+            </w:pPr>
+            <w:r>
+              <w:rPr>
+                <w:rFonts w:ascii="Times New Roman" w:hAnsi="Times New Roman"/>
+                <w:sz w:val="18"/>
+              </w:rPr>
+              <w:t>+14.39***</w:t>
+            </w:r>
+          </w:p>
+        </w:tc>
+        <w:tc>
+          <w:tcPr>
+            <w:tcW w:type="dxa" w:w="1020"/>
+            <w:tcBorders>
+              <w:top w:val="nil"/>
+              <w:left w:val="nil"/>
+              <w:bottom w:val="nil"/>
+              <w:right w:val="nil"/>
+            </w:tcBorders>
+          </w:tcPr>
+          <w:p>
+            <w:pPr>
+              <w:jc w:val="right"/>
+            </w:pPr>
+            <w:r>
+              <w:rPr>
+                <w:rFonts w:ascii="Times New Roman" w:hAnsi="Times New Roman"/>
+                <w:sz w:val="18"/>
+              </w:rPr>
+              <w:t>+15.37***</w:t>
+            </w:r>
+          </w:p>
+        </w:tc>
+        <w:tc>
+          <w:tcPr>
+            <w:tcW w:type="dxa" w:w="1020"/>
+            <w:tcBorders>
+              <w:top w:val="nil"/>
+              <w:left w:val="nil"/>
+              <w:bottom w:val="nil"/>
+              <w:right w:val="nil"/>
+            </w:tcBorders>
+          </w:tcPr>
+          <w:p>
+            <w:pPr>
+              <w:jc w:val="right"/>
+            </w:pPr>
+            <w:r>
+              <w:rPr>
+                <w:rFonts w:ascii="Times New Roman" w:hAnsi="Times New Roman"/>
+                <w:sz w:val="18"/>
+              </w:rPr>
+              <w:t>+3.15**</w:t>
+            </w:r>
+          </w:p>
+        </w:tc>
+        <w:tc>
+          <w:tcPr>
+            <w:tcW w:type="dxa" w:w="1020"/>
+            <w:tcBorders>
+              <w:top w:val="nil"/>
+              <w:left w:val="nil"/>
+              <w:bottom w:val="nil"/>
+              <w:right w:val="nil"/>
+            </w:tcBorders>
+          </w:tcPr>
+          <w:p>
+            <w:pPr>
+              <w:jc w:val="right"/>
+            </w:pPr>
+            <w:r>
+              <w:rPr>
+                <w:rFonts w:ascii="Times New Roman" w:hAnsi="Times New Roman"/>
+                <w:sz w:val="18"/>
+              </w:rPr>
+              <w:t>+80.12***</w:t>
+            </w:r>
+          </w:p>
+        </w:tc>
+        <w:tc>
+          <w:tcPr>
+            <w:tcW w:type="dxa" w:w="1020"/>
+            <w:tcBorders>
+              <w:top w:val="nil"/>
+              <w:left w:val="nil"/>
+              <w:bottom w:val="nil"/>
+              <w:right w:val="nil"/>
+            </w:tcBorders>
+          </w:tcPr>
+          <w:p>
+            <w:pPr>
+              <w:jc w:val="right"/>
+            </w:pPr>
+            <w:r>
+              <w:rPr>
+                <w:rFonts w:ascii="Times New Roman" w:hAnsi="Times New Roman"/>
+                <w:sz w:val="18"/>
+              </w:rPr>
+              <w:t>−42.71***</w:t>
+            </w:r>
+          </w:p>
+        </w:tc>
+        <w:tc>
+          <w:tcPr>
+            <w:tcW w:type="dxa" w:w="1020"/>
+            <w:tcBorders>
+              <w:top w:val="nil"/>
+              <w:left w:val="nil"/>
+              <w:bottom w:val="nil"/>
+              <w:right w:val="nil"/>
+            </w:tcBorders>
+          </w:tcPr>
+          <w:p>
+            <w:pPr>
+              <w:jc w:val="right"/>
+            </w:pPr>
+            <w:r>
+              <w:rPr>
+                <w:rFonts w:ascii="Times New Roman" w:hAnsi="Times New Roman"/>
+                <w:sz w:val="18"/>
+              </w:rPr>
+              <w:t>−44.48***</w:t>
+            </w:r>
+          </w:p>
+        </w:tc>
+        <w:tc>
+          <w:tcPr>
+            <w:tcW w:type="dxa" w:w="1020"/>
+            <w:tcBorders>
+              <w:top w:val="nil"/>
+              <w:left w:val="nil"/>
+              <w:bottom w:val="nil"/>
+              <w:right w:val="nil"/>
+            </w:tcBorders>
+          </w:tcPr>
+          <w:p>
+            <w:pPr>
+              <w:jc w:val="right"/>
+            </w:pPr>
+            <w:r>
+              <w:rPr>
+                <w:rFonts w:ascii="Times New Roman" w:hAnsi="Times New Roman"/>
+                <w:sz w:val="18"/>
+              </w:rPr>
+              <w:t>−36.75***</w:t>
+            </w:r>
+          </w:p>
+        </w:tc>
+        <w:tc>
+          <w:tcPr>
+            <w:tcW w:type="dxa" w:w="1020"/>
+            <w:tcBorders>
+              <w:top w:val="nil"/>
+              <w:left w:val="nil"/>
+              <w:bottom w:val="nil"/>
+              <w:right w:val="nil"/>
+            </w:tcBorders>
+          </w:tcPr>
+          <w:p>
+            <w:pPr>
+              <w:jc w:val="right"/>
+            </w:pPr>
+            <w:r>
+              <w:rPr>
+                <w:rFonts w:ascii="Times New Roman" w:hAnsi="Times New Roman"/>
+                <w:sz w:val="18"/>
+              </w:rPr>
+              <w:t>−31.31***</w:t>
+            </w:r>
+          </w:p>
+        </w:tc>
+        <w:tc>
+          <w:tcPr>
+            <w:tcW w:type="dxa" w:w="1020"/>
+            <w:tcBorders>
+              <w:top w:val="nil"/>
+              <w:left w:val="nil"/>
+              <w:bottom w:val="nil"/>
+              <w:right w:val="nil"/>
+            </w:tcBorders>
+          </w:tcPr>
+          <w:p>
+            <w:pPr>
+              <w:jc w:val="right"/>
+            </w:pPr>
+            <w:r>
+              <w:rPr>
+                <w:rFonts w:ascii="Times New Roman" w:hAnsi="Times New Roman"/>
+                <w:sz w:val="18"/>
+              </w:rPr>
+              <w:t>+174.49***</w:t>
+            </w:r>
+          </w:p>
+        </w:tc>
+        <w:tc>
+          <w:tcPr>
+            <w:tcW w:type="dxa" w:w="1020"/>
+            <w:tcBorders>
+              <w:top w:val="nil"/>
+              <w:left w:val="nil"/>
+              <w:bottom w:val="nil"/>
+              <w:right w:val="nil"/>
+            </w:tcBorders>
+          </w:tcPr>
+          <w:p>
+            <w:pPr>
+              <w:jc w:val="right"/>
+            </w:pPr>
+            <w:r>
+              <w:rPr>
+                <w:rFonts w:ascii="Times New Roman" w:hAnsi="Times New Roman"/>
+                <w:sz w:val="18"/>
+              </w:rPr>
+              <w:t>−89.89***</w:t>
+            </w:r>
+          </w:p>
+        </w:tc>
+      </w:tr>
+      <w:tr>
+        <w:tc>
+          <w:tcPr>
+            <w:tcW w:type="dxa" w:w="1020"/>
+            <w:tcBorders>
+              <w:top w:val="nil"/>
+              <w:left w:val="nil"/>
+              <w:bottom w:val="nil"/>
+              <w:right w:val="nil"/>
+            </w:tcBorders>
+          </w:tcPr>
+          <w:p>
+            <w:r>
+              <w:rPr>
+                <w:rFonts w:ascii="Times New Roman" w:hAnsi="Times New Roman"/>
+                <w:sz w:val="18"/>
+              </w:rPr>
+              <w:t>m4g_6b</w:t>
+            </w:r>
+          </w:p>
+        </w:tc>
+        <w:tc>
+          <w:tcPr>
+            <w:tcW w:type="dxa" w:w="1020"/>
+            <w:tcBorders>
+              <w:top w:val="nil"/>
+              <w:left w:val="nil"/>
+              <w:bottom w:val="nil"/>
+              <w:right w:val="nil"/>
+            </w:tcBorders>
+          </w:tcPr>
+          <w:p>
+            <w:r>
+              <w:rPr>
+                <w:rFonts w:ascii="Times New Roman" w:hAnsi="Times New Roman"/>
+                <w:sz w:val="18"/>
+              </w:rPr>
+              <w:t>m1g_6b</w:t>
+            </w:r>
+          </w:p>
+        </w:tc>
+        <w:tc>
+          <w:tcPr>
+            <w:tcW w:type="dxa" w:w="1020"/>
+            <w:tcBorders>
+              <w:top w:val="nil"/>
+              <w:left w:val="nil"/>
+              <w:bottom w:val="nil"/>
+              <w:right w:val="nil"/>
+            </w:tcBorders>
+          </w:tcPr>
+          <w:p>
+            <w:pPr>
+              <w:jc w:val="right"/>
+            </w:pPr>
+            <w:r>
+              <w:rPr>
+                <w:rFonts w:ascii="Times New Roman" w:hAnsi="Times New Roman"/>
+                <w:sz w:val="18"/>
+              </w:rPr>
+              <w:t>+14.30***</w:t>
+            </w:r>
+          </w:p>
+        </w:tc>
+        <w:tc>
+          <w:tcPr>
+            <w:tcW w:type="dxa" w:w="1020"/>
+            <w:tcBorders>
+              <w:top w:val="nil"/>
+              <w:left w:val="nil"/>
+              <w:bottom w:val="nil"/>
+              <w:right w:val="nil"/>
+            </w:tcBorders>
+          </w:tcPr>
+          <w:p>
+            <w:pPr>
+              <w:jc w:val="right"/>
+            </w:pPr>
+            <w:r>
+              <w:rPr>
+                <w:rFonts w:ascii="Times New Roman" w:hAnsi="Times New Roman"/>
+                <w:sz w:val="18"/>
+              </w:rPr>
+              <w:t>+17.25***</w:t>
+            </w:r>
+          </w:p>
+        </w:tc>
+        <w:tc>
+          <w:tcPr>
+            <w:tcW w:type="dxa" w:w="1020"/>
+            <w:tcBorders>
+              <w:top w:val="nil"/>
+              <w:left w:val="nil"/>
+              <w:bottom w:val="nil"/>
+              <w:right w:val="nil"/>
+            </w:tcBorders>
+          </w:tcPr>
+          <w:p>
+            <w:pPr>
+              <w:jc w:val="right"/>
+            </w:pPr>
+            <w:r>
+              <w:rPr>
+                <w:rFonts w:ascii="Times New Roman" w:hAnsi="Times New Roman"/>
+                <w:sz w:val="18"/>
+              </w:rPr>
+              <w:t>+4.21**</w:t>
+            </w:r>
+          </w:p>
+        </w:tc>
+        <w:tc>
+          <w:tcPr>
+            <w:tcW w:type="dxa" w:w="1020"/>
+            <w:tcBorders>
+              <w:top w:val="nil"/>
+              <w:left w:val="nil"/>
+              <w:bottom w:val="nil"/>
+              <w:right w:val="nil"/>
+            </w:tcBorders>
+          </w:tcPr>
+          <w:p>
+            <w:pPr>
+              <w:jc w:val="right"/>
+            </w:pPr>
+            <w:r>
+              <w:rPr>
+                <w:rFonts w:ascii="Times New Roman" w:hAnsi="Times New Roman"/>
+                <w:sz w:val="18"/>
+              </w:rPr>
+              <w:t>+63.69***</w:t>
+            </w:r>
+          </w:p>
+        </w:tc>
+        <w:tc>
+          <w:tcPr>
+            <w:tcW w:type="dxa" w:w="1020"/>
+            <w:tcBorders>
+              <w:top w:val="nil"/>
+              <w:left w:val="nil"/>
+              <w:bottom w:val="nil"/>
+              <w:right w:val="nil"/>
+            </w:tcBorders>
+          </w:tcPr>
+          <w:p>
+            <w:pPr>
+              <w:jc w:val="right"/>
+            </w:pPr>
+            <w:r>
+              <w:rPr>
+                <w:rFonts w:ascii="Times New Roman" w:hAnsi="Times New Roman"/>
+                <w:sz w:val="18"/>
+              </w:rPr>
+              <w:t>−36.30***</w:t>
+            </w:r>
+          </w:p>
+        </w:tc>
+        <w:tc>
+          <w:tcPr>
+            <w:tcW w:type="dxa" w:w="1020"/>
+            <w:tcBorders>
+              <w:top w:val="nil"/>
+              <w:left w:val="nil"/>
+              <w:bottom w:val="nil"/>
+              <w:right w:val="nil"/>
+            </w:tcBorders>
+          </w:tcPr>
+          <w:p>
+            <w:pPr>
+              <w:jc w:val="right"/>
+            </w:pPr>
+            <w:r>
+              <w:rPr>
+                <w:rFonts w:ascii="Times New Roman" w:hAnsi="Times New Roman"/>
+                <w:sz w:val="18"/>
+              </w:rPr>
+              <w:t>−38.88***</w:t>
+            </w:r>
+          </w:p>
+        </w:tc>
+        <w:tc>
+          <w:tcPr>
+            <w:tcW w:type="dxa" w:w="1020"/>
+            <w:tcBorders>
+              <w:top w:val="nil"/>
+              <w:left w:val="nil"/>
+              <w:bottom w:val="nil"/>
+              <w:right w:val="nil"/>
+            </w:tcBorders>
+          </w:tcPr>
+          <w:p>
+            <w:pPr>
+              <w:jc w:val="right"/>
+            </w:pPr>
+            <w:r>
+              <w:rPr>
+                <w:rFonts w:ascii="Times New Roman" w:hAnsi="Times New Roman"/>
+                <w:sz w:val="18"/>
+              </w:rPr>
+              <w:t>−36.92***</w:t>
+            </w:r>
+          </w:p>
+        </w:tc>
+        <w:tc>
+          <w:tcPr>
+            <w:tcW w:type="dxa" w:w="1020"/>
+            <w:tcBorders>
+              <w:top w:val="nil"/>
+              <w:left w:val="nil"/>
+              <w:bottom w:val="nil"/>
+              <w:right w:val="nil"/>
+            </w:tcBorders>
+          </w:tcPr>
+          <w:p>
+            <w:pPr>
+              <w:jc w:val="right"/>
+            </w:pPr>
+            <w:r>
+              <w:rPr>
+                <w:rFonts w:ascii="Times New Roman" w:hAnsi="Times New Roman"/>
+                <w:sz w:val="18"/>
+              </w:rPr>
+              <w:t>−29.86***</w:t>
+            </w:r>
+          </w:p>
+        </w:tc>
+        <w:tc>
+          <w:tcPr>
+            <w:tcW w:type="dxa" w:w="1020"/>
+            <w:tcBorders>
+              <w:top w:val="nil"/>
+              <w:left w:val="nil"/>
+              <w:bottom w:val="nil"/>
+              <w:right w:val="nil"/>
+            </w:tcBorders>
+          </w:tcPr>
+          <w:p>
+            <w:pPr>
+              <w:jc w:val="right"/>
+            </w:pPr>
+            <w:r>
+              <w:rPr>
+                <w:rFonts w:ascii="Times New Roman" w:hAnsi="Times New Roman"/>
+                <w:sz w:val="18"/>
+              </w:rPr>
+              <w:t>+156.03***</w:t>
+            </w:r>
+          </w:p>
+        </w:tc>
+        <w:tc>
+          <w:tcPr>
+            <w:tcW w:type="dxa" w:w="1020"/>
+            <w:tcBorders>
+              <w:top w:val="nil"/>
+              <w:left w:val="nil"/>
+              <w:bottom w:val="nil"/>
+              <w:right w:val="nil"/>
+            </w:tcBorders>
+          </w:tcPr>
+          <w:p>
+            <w:pPr>
+              <w:jc w:val="right"/>
+            </w:pPr>
+            <w:r>
+              <w:rPr>
+                <w:rFonts w:ascii="Times New Roman" w:hAnsi="Times New Roman"/>
+                <w:sz w:val="18"/>
+              </w:rPr>
+              <w:t>−89.45***</w:t>
+            </w:r>
+          </w:p>
+        </w:tc>
+      </w:tr>
+      <w:tr>
+        <w:tc>
+          <w:tcPr>
+            <w:tcW w:type="dxa" w:w="1020"/>
+            <w:tcBorders>
+              <w:top w:val="nil"/>
+              <w:left w:val="nil"/>
+              <w:bottom w:val="nil"/>
+              <w:right w:val="nil"/>
+            </w:tcBorders>
+          </w:tcPr>
+          <w:p>
+            <w:r>
+              <w:rPr>
+                <w:rFonts w:ascii="Times New Roman" w:hAnsi="Times New Roman"/>
+                <w:sz w:val="18"/>
+              </w:rPr>
+              <w:t>m5_pure_10b</w:t>
+            </w:r>
+          </w:p>
+        </w:tc>
+        <w:tc>
+          <w:tcPr>
+            <w:tcW w:type="dxa" w:w="1020"/>
+            <w:tcBorders>
+              <w:top w:val="nil"/>
+              <w:left w:val="nil"/>
+              <w:bottom w:val="nil"/>
+              <w:right w:val="nil"/>
+            </w:tcBorders>
+          </w:tcPr>
+          <w:p>
+            <w:r>
+              <w:rPr>
+                <w:rFonts w:ascii="Times New Roman" w:hAnsi="Times New Roman"/>
+                <w:sz w:val="18"/>
+              </w:rPr>
+              <w:t>m1g_10b</w:t>
+            </w:r>
+          </w:p>
+        </w:tc>
+        <w:tc>
+          <w:tcPr>
+            <w:tcW w:type="dxa" w:w="1020"/>
+            <w:tcBorders>
+              <w:top w:val="nil"/>
+              <w:left w:val="nil"/>
+              <w:bottom w:val="nil"/>
+              <w:right w:val="nil"/>
+            </w:tcBorders>
+          </w:tcPr>
+          <w:p>
+            <w:pPr>
+              <w:jc w:val="right"/>
+            </w:pPr>
+            <w:r>
+              <w:rPr>
+                <w:rFonts w:ascii="Times New Roman" w:hAnsi="Times New Roman"/>
+                <w:sz w:val="18"/>
+              </w:rPr>
+              <w:t>+0.92*</w:t>
+            </w:r>
+          </w:p>
+        </w:tc>
+        <w:tc>
+          <w:tcPr>
+            <w:tcW w:type="dxa" w:w="1020"/>
+            <w:tcBorders>
+              <w:top w:val="nil"/>
+              <w:left w:val="nil"/>
+              <w:bottom w:val="nil"/>
+              <w:right w:val="nil"/>
+            </w:tcBorders>
+          </w:tcPr>
+          <w:p>
+            <w:pPr>
+              <w:jc w:val="right"/>
+            </w:pPr>
+            <w:r>
+              <w:rPr>
+                <w:rFonts w:ascii="Times New Roman" w:hAnsi="Times New Roman"/>
+                <w:sz w:val="18"/>
+              </w:rPr>
+              <w:t>+2.18**</w:t>
+            </w:r>
+          </w:p>
+        </w:tc>
+        <w:tc>
+          <w:tcPr>
+            <w:tcW w:type="dxa" w:w="1020"/>
+            <w:tcBorders>
+              <w:top w:val="nil"/>
+              <w:left w:val="nil"/>
+              <w:bottom w:val="nil"/>
+              <w:right w:val="nil"/>
+            </w:tcBorders>
+          </w:tcPr>
+          <w:p>
+            <w:pPr>
+              <w:jc w:val="right"/>
+            </w:pPr>
+            <w:r>
+              <w:rPr>
+                <w:rFonts w:ascii="Times New Roman" w:hAnsi="Times New Roman"/>
+                <w:sz w:val="18"/>
+              </w:rPr>
+              <w:t>−7.59***</w:t>
+            </w:r>
+          </w:p>
+        </w:tc>
+        <w:tc>
+          <w:tcPr>
+            <w:tcW w:type="dxa" w:w="1020"/>
+            <w:tcBorders>
+              <w:top w:val="nil"/>
+              <w:left w:val="nil"/>
+              <w:bottom w:val="nil"/>
+              <w:right w:val="nil"/>
+            </w:tcBorders>
+          </w:tcPr>
+          <w:p>
+            <w:pPr>
+              <w:jc w:val="right"/>
+            </w:pPr>
+            <w:r>
+              <w:rPr>
+                <w:rFonts w:ascii="Times New Roman" w:hAnsi="Times New Roman"/>
+                <w:sz w:val="18"/>
+              </w:rPr>
+              <w:t>+88.28***</w:t>
+            </w:r>
+          </w:p>
+        </w:tc>
+        <w:tc>
+          <w:tcPr>
+            <w:tcW w:type="dxa" w:w="1020"/>
+            <w:tcBorders>
+              <w:top w:val="nil"/>
+              <w:left w:val="nil"/>
+              <w:bottom w:val="nil"/>
+              <w:right w:val="nil"/>
+            </w:tcBorders>
+          </w:tcPr>
+          <w:p>
+            <w:pPr>
+              <w:jc w:val="right"/>
+            </w:pPr>
+            <w:r>
+              <w:rPr>
+                <w:rFonts w:ascii="Times New Roman" w:hAnsi="Times New Roman"/>
+                <w:sz w:val="18"/>
+              </w:rPr>
+              <w:t>−50.92***</w:t>
+            </w:r>
+          </w:p>
+        </w:tc>
+        <w:tc>
+          <w:tcPr>
+            <w:tcW w:type="dxa" w:w="1020"/>
+            <w:tcBorders>
+              <w:top w:val="nil"/>
+              <w:left w:val="nil"/>
+              <w:bottom w:val="nil"/>
+              <w:right w:val="nil"/>
+            </w:tcBorders>
+          </w:tcPr>
+          <w:p>
+            <w:pPr>
+              <w:jc w:val="right"/>
+            </w:pPr>
+            <w:r>
+              <w:rPr>
+                <w:rFonts w:ascii="Times New Roman" w:hAnsi="Times New Roman"/>
+                <w:sz w:val="18"/>
+              </w:rPr>
+              <w:t>−46.89***</w:t>
+            </w:r>
+          </w:p>
+        </w:tc>
+        <w:tc>
+          <w:tcPr>
+            <w:tcW w:type="dxa" w:w="1020"/>
+            <w:tcBorders>
+              <w:top w:val="nil"/>
+              <w:left w:val="nil"/>
+              <w:bottom w:val="nil"/>
+              <w:right w:val="nil"/>
+            </w:tcBorders>
+          </w:tcPr>
+          <w:p>
+            <w:pPr>
+              <w:jc w:val="right"/>
+            </w:pPr>
+            <w:r>
+              <w:rPr>
+                <w:rFonts w:ascii="Times New Roman" w:hAnsi="Times New Roman"/>
+                <w:sz w:val="18"/>
+              </w:rPr>
+              <w:t>−38.84***</w:t>
+            </w:r>
+          </w:p>
+        </w:tc>
+        <w:tc>
+          <w:tcPr>
+            <w:tcW w:type="dxa" w:w="1020"/>
+            <w:tcBorders>
+              <w:top w:val="nil"/>
+              <w:left w:val="nil"/>
+              <w:bottom w:val="nil"/>
+              <w:right w:val="nil"/>
+            </w:tcBorders>
+          </w:tcPr>
+          <w:p>
+            <w:pPr>
+              <w:jc w:val="right"/>
+            </w:pPr>
+            <w:r>
+              <w:rPr>
+                <w:rFonts w:ascii="Times New Roman" w:hAnsi="Times New Roman"/>
+                <w:sz w:val="18"/>
+              </w:rPr>
+              <w:t>−35.32***</w:t>
+            </w:r>
+          </w:p>
+        </w:tc>
+        <w:tc>
+          <w:tcPr>
+            <w:tcW w:type="dxa" w:w="1020"/>
+            <w:tcBorders>
+              <w:top w:val="nil"/>
+              <w:left w:val="nil"/>
+              <w:bottom w:val="nil"/>
+              <w:right w:val="nil"/>
+            </w:tcBorders>
+          </w:tcPr>
+          <w:p>
+            <w:pPr>
+              <w:jc w:val="right"/>
+            </w:pPr>
+            <w:r>
+              <w:rPr>
+                <w:rFonts w:ascii="Times New Roman" w:hAnsi="Times New Roman"/>
+                <w:sz w:val="18"/>
+              </w:rPr>
+              <w:t>+141.48***</w:t>
+            </w:r>
+          </w:p>
+        </w:tc>
+        <w:tc>
+          <w:tcPr>
+            <w:tcW w:type="dxa" w:w="1020"/>
+            <w:tcBorders>
+              <w:top w:val="nil"/>
+              <w:left w:val="nil"/>
+              <w:bottom w:val="nil"/>
+              <w:right w:val="nil"/>
+            </w:tcBorders>
+          </w:tcPr>
+          <w:p>
+            <w:pPr>
+              <w:jc w:val="right"/>
+            </w:pPr>
+            <w:r>
+              <w:rPr>
+                <w:rFonts w:ascii="Times New Roman" w:hAnsi="Times New Roman"/>
+                <w:sz w:val="18"/>
+              </w:rPr>
+              <w:t>−50.89*</w:t>
+            </w:r>
+          </w:p>
+        </w:tc>
+      </w:tr>
+      <w:tr>
         <w:tc>
           <w:tcPr>
             <w:tcW w:type="dxa" w:w="1020"/>
@@ -4436,15 +5504,12 @@
             </w:tcBorders>
           </w:tcPr>
           <w:p>
-            <w:pPr>
-              <w:jc w:val="right"/>
-            </w:pPr>
             <w:r>
               <w:rPr>
                 <w:rFonts w:ascii="Times New Roman" w:hAnsi="Times New Roman"/>
                 <w:sz w:val="18"/>
               </w:rPr>
-              <w:t>−0.01</w:t>
+              <w:t>m1g_10b</w:t>
             </w:r>
           </w:p>
         </w:tc>
@@ -4467,7 +5532,7 @@
                 <w:rFonts w:ascii="Times New Roman" w:hAnsi="Times New Roman"/>
                 <w:sz w:val="18"/>
               </w:rPr>
-              <w:t>−1.50**</w:t>
+              <w:t>+0.93*</w:t>
             </w:r>
           </w:p>
         </w:tc>
@@ -4490,7 +5555,7 @@
                 <w:rFonts w:ascii="Times New Roman" w:hAnsi="Times New Roman"/>
                 <w:sz w:val="18"/>
               </w:rPr>
-              <w:t>−1.59*</w:t>
+              <w:t>+3.74***</w:t>
             </w:r>
           </w:p>
         </w:tc>
@@ -4513,7 +5578,7 @@
                 <w:rFonts w:ascii="Times New Roman" w:hAnsi="Times New Roman"/>
                 <w:sz w:val="18"/>
               </w:rPr>
-              <w:t>+11.02***</w:t>
+              <w:t>−6.10***</w:t>
             </w:r>
           </w:p>
         </w:tc>
@@ -4536,7 +5601,7 @@
                 <w:rFonts w:ascii="Times New Roman" w:hAnsi="Times New Roman"/>
                 <w:sz w:val="18"/>
               </w:rPr>
-              <w:t>−11.36***</w:t>
+              <w:t>+69.59***</w:t>
             </w:r>
           </w:p>
         </w:tc>
@@ -4559,7 +5624,7 @@
                 <w:rFonts w:ascii="Times New Roman" w:hAnsi="Times New Roman"/>
                 <w:sz w:val="18"/>
               </w:rPr>
-              <w:t>−9.92***</w:t>
+              <w:t>−44.63***</w:t>
             </w:r>
           </w:p>
         </w:tc>
@@ -4582,7 +5647,7 @@
                 <w:rFonts w:ascii="Times New Roman" w:hAnsi="Times New Roman"/>
                 <w:sz w:val="18"/>
               </w:rPr>
-              <w:t>−0.90</w:t>
+              <w:t>−41.04***</w:t>
             </w:r>
           </w:p>
         </w:tc>
@@ -4605,7 +5670,7 @@
                 <w:rFonts w:ascii="Times New Roman" w:hAnsi="Times New Roman"/>
                 <w:sz w:val="18"/>
               </w:rPr>
-              <w:t>−2.76*</w:t>
+              <w:t>−38.29***</w:t>
             </w:r>
           </w:p>
         </w:tc>
@@ -4628,7 +5693,7 @@
                 <w:rFonts w:ascii="Times New Roman" w:hAnsi="Times New Roman"/>
                 <w:sz w:val="18"/>
               </w:rPr>
-              <w:t>+14.52**</w:t>
+              <w:t>−33.49***</w:t>
             </w:r>
           </w:p>
         </w:tc>
@@ -4651,7 +5716,30 @@
                 <w:rFonts w:ascii="Times New Roman" w:hAnsi="Times New Roman"/>
                 <w:sz w:val="18"/>
               </w:rPr>
-              <w:t>+1.27</w:t>
+              <w:t>+110.86***</w:t>
+            </w:r>
+          </w:p>
+        </w:tc>
+        <w:tc>
+          <w:tcPr>
+            <w:tcW w:type="dxa" w:w="1020"/>
+            <w:tcBorders>
+              <w:top w:val="nil"/>
+              <w:left w:val="nil"/>
+              <w:bottom w:val="single" w:sz="8" w:color="000000"/>
+              <w:right w:val="nil"/>
+            </w:tcBorders>
+          </w:tcPr>
+          <w:p>
+            <w:pPr>
+              <w:jc w:val="right"/>
+            </w:pPr>
+            <w:r>
+              <w:rPr>
+                <w:rFonts w:ascii="Times New Roman" w:hAnsi="Times New Roman"/>
+                <w:sz w:val="18"/>
+              </w:rPr>
+              <w:t>−51.51*</w:t>
             </w:r>
           </w:p>
         </w:tc>

</xml_diff>